<commit_message>
feat(demo): serve a preprocessed sample base on the public site
The free Render instance has a fraction of a CPU and an ephemeral disk,
so processing the seven samples at every restart made visitors wait
(minutes for the scanned ones' OCR). Samples are now processed once,
off the server, by scripts/gerar_base_demo.py (rules, or an AI provider
with --provedor), and saved as JSON in samples/processados/ with data,
page text, triage, alerts and index. In demo mode the server imports
that base at startup: all seven documents are available in ~2.7 s
locally, with no OCR or AI calls.

Each JSON records the source file's hash; if a sample changes and the
base is not regenerated, the stale JSON is ignored and that sample is
processed by rules in the background, as before.

Co-Authored-By: Claude Opus 5.5 <noreply@anthropic.com>
</commit_message>
<xml_diff>
--- a/Projeto_Final/docs/relatorio/InsurMinds – Projeto Final.docx
+++ b/Projeto_Final/docs/relatorio/InsurMinds – Projeto Final.docx
@@ -6743,7 +6743,27 @@
           <w:color w:val="1F2937"/>
           <w:sz w:val="20"/>
         </w:rPr>
-        <w:t xml:space="preserve">No site publicado, o servidor processa os sete documentos de exemplo ao iniciar, em segundo plano, para responder imediatamente mesmo quando "acorda" (o disco do plano gratuito é apagado a cada reinício). As amostras são </w:t>
+        <w:t xml:space="preserve">No site publicado, os sete documentos de exemplo vêm de uma </w:t>
+      </w:r>
+      <w:r>
+        <w:rPr>
+          <w:rFonts w:ascii="Segoe UI" w:hAnsi="Segoe UI" w:eastAsia="Segoe UI"/>
+          <w:b/>
+          <w:i w:val="0"/>
+          <w:color w:val="1F2937"/>
+          <w:sz w:val="20"/>
+        </w:rPr>
+        <w:t>base pré-processada</w:t>
+      </w:r>
+      <w:r>
+        <w:rPr>
+          <w:rFonts w:ascii="Segoe UI" w:hAnsi="Segoe UI" w:eastAsia="Segoe UI"/>
+          <w:b w:val="0"/>
+          <w:i w:val="0"/>
+          <w:color w:val="1F2937"/>
+          <w:sz w:val="20"/>
+        </w:rPr>
+        <w:t xml:space="preserve">, gerada fora do servidor e importada ao iniciar: tudo fica disponível em cerca de 2 segundos, sem OCR nem chamadas à IA, mesmo quando o servidor "acorda" (o disco do plano gratuito é apagado a cada reinício). Antes, só o OCR das amostras digitalizadas levava minutos na CPU do plano gratuito. As amostras são </w:t>
       </w:r>
       <w:r>
         <w:rPr>

</xml_diff>